<commit_message>
POO S6 (Herencia): piloto de rigor - contenido profundo (2 sesiones + actividad)
</commit_message>
<xml_diff>
--- a/06-week/optional-activity/pdf/Actividad-Semana06.docx
+++ b/06-week/optional-activity/pdf/Actividad-Semana06.docx
@@ -31,7 +31,7 @@
           <w:sz w:val="22"/>
           <w:szCs w:val="22"/>
         </w:rPr>
-        <w:t xml:space="preserve">Programación y Diseño Orientado a Objetos · Semana 6 · Jerarquía de clases con herencia</w:t>
+        <w:t xml:space="preserve">Programación y Diseño Orientado a Objetos · Semana 6 · Jerarquía de clases con herencia y super</w:t>
       </w:r>
     </w:p>
     <w:tbl>
@@ -430,7 +430,7 @@
           <w:sz w:val="22"/>
           <w:szCs w:val="22"/>
         </w:rPr>
-        <w:t xml:space="preserve">Diseñar una superclase y subclases con extends.</w:t>
+        <w:t xml:space="preserve">Justificar una jerarquía con el criterio de sustitución (es-un).</w:t>
       </w:r>
     </w:p>
     <w:p>
@@ -454,7 +454,7 @@
           <w:sz w:val="22"/>
           <w:szCs w:val="22"/>
         </w:rPr>
-        <w:t xml:space="preserve">Reutilizar el constructor del padre con super.</w:t>
+        <w:t xml:space="preserve">Implementar la cadena de constructores con super(...).</w:t>
       </w:r>
     </w:p>
     <w:p>
@@ -478,7 +478,31 @@
           <w:sz w:val="22"/>
           <w:szCs w:val="22"/>
         </w:rPr>
-        <w:t xml:space="preserve">Ampliar métodos con super.metodo().</w:t>
+        <w:t xml:space="preserve">Ampliar comportamiento heredado con super.metodo().</w:t>
+      </w:r>
+    </w:p>
+    <w:p>
+      <w:pPr>
+        <w:spacing w:after="120" w:line="276" w:lineRule="auto"/>
+        <w:ind w:left="454" w:hanging="284"/>
+      </w:pPr>
+      <w:r>
+        <w:rPr>
+          <w:rFonts w:ascii="Times New Roman" w:hAnsi="Times New Roman" w:cs="Times New Roman"/>
+          <w:color w:val="000000"/>
+          <w:sz w:val="22"/>
+          <w:szCs w:val="22"/>
+        </w:rPr>
+        <w:t xml:space="preserve">•	</w:t>
+      </w:r>
+      <w:r>
+        <w:rPr>
+          <w:rFonts w:ascii="Times New Roman" w:hAnsi="Times New Roman" w:cs="Times New Roman"/>
+          <w:color w:val="000000"/>
+          <w:sz w:val="22"/>
+          <w:szCs w:val="22"/>
+        </w:rPr>
+        <w:t xml:space="preserve">Verificar el orden de construcción con una traza.</w:t>
       </w:r>
     </w:p>
     <w:p>
@@ -497,94 +521,32 @@
           <w:sz w:val="26"/>
           <w:szCs w:val="26"/>
         </w:rPr>
-        <w:t xml:space="preserve">1. Enunciado</w:t>
+        <w:t xml:space="preserve">1. Contexto</w:t>
       </w:r>
     </w:p>
     <w:p>
       <w:pPr>
         <w:spacing w:after="120" w:line="276" w:lineRule="auto"/>
-        <w:ind w:left="454" w:hanging="284"/>
-      </w:pPr>
-      <w:r>
-        <w:rPr>
-          <w:rFonts w:ascii="Times New Roman" w:hAnsi="Times New Roman" w:cs="Times New Roman"/>
-          <w:color w:val="000000"/>
-          <w:sz w:val="22"/>
-          <w:szCs w:val="22"/>
-        </w:rPr>
-        <w:t xml:space="preserve">1.	</w:t>
-      </w:r>
-      <w:r>
-        <w:rPr>
-          <w:rFonts w:ascii="Times New Roman" w:hAnsi="Times New Roman" w:cs="Times New Roman"/>
-          <w:color w:val="000000"/>
-          <w:sz w:val="22"/>
-          <w:szCs w:val="22"/>
-        </w:rPr>
-        <w:t xml:space="preserve">Crea la superclase </w:t>
-      </w:r>
-      <w:r>
-        <w:rPr>
-          <w:rFonts w:ascii="Consolas" w:hAnsi="Consolas" w:cs="Consolas"/>
-          <w:color w:val="000000"/>
-          <w:sz w:val="22"/>
-          <w:szCs w:val="22"/>
-        </w:rPr>
-        <w:t xml:space="preserve">Empleado</w:t>
-      </w:r>
-      <w:r>
-        <w:rPr>
-          <w:rFonts w:ascii="Times New Roman" w:hAnsi="Times New Roman" w:cs="Times New Roman"/>
-          <w:color w:val="000000"/>
-          <w:sz w:val="22"/>
-          <w:szCs w:val="22"/>
-        </w:rPr>
-        <w:t xml:space="preserve"> con </w:t>
-      </w:r>
-      <w:r>
-        <w:rPr>
-          <w:rFonts w:ascii="Consolas" w:hAnsi="Consolas" w:cs="Consolas"/>
-          <w:color w:val="000000"/>
-          <w:sz w:val="22"/>
-          <w:szCs w:val="22"/>
-        </w:rPr>
-        <w:t xml:space="preserve">nombre</w:t>
-      </w:r>
-      <w:r>
-        <w:rPr>
-          <w:rFonts w:ascii="Times New Roman" w:hAnsi="Times New Roman" w:cs="Times New Roman"/>
-          <w:color w:val="000000"/>
-          <w:sz w:val="22"/>
-          <w:szCs w:val="22"/>
-        </w:rPr>
-        <w:t xml:space="preserve">, </w:t>
-      </w:r>
-      <w:r>
-        <w:rPr>
-          <w:rFonts w:ascii="Consolas" w:hAnsi="Consolas" w:cs="Consolas"/>
-          <w:color w:val="000000"/>
-          <w:sz w:val="22"/>
-          <w:szCs w:val="22"/>
-        </w:rPr>
-        <w:t xml:space="preserve">salario</w:t>
-      </w:r>
-      <w:r>
-        <w:rPr>
-          <w:rFonts w:ascii="Times New Roman" w:hAnsi="Times New Roman" w:cs="Times New Roman"/>
-          <w:color w:val="000000"/>
-          <w:sz w:val="22"/>
-          <w:szCs w:val="22"/>
-        </w:rPr>
-        <w:t xml:space="preserve"> y método </w:t>
-      </w:r>
-      <w:r>
-        <w:rPr>
-          <w:rFonts w:ascii="Consolas" w:hAnsi="Consolas" w:cs="Consolas"/>
-          <w:color w:val="000000"/>
-          <w:sz w:val="22"/>
-          <w:szCs w:val="22"/>
-        </w:rPr>
-        <w:t xml:space="preserve">datos()</w:t>
+        <w:jc w:val="both"/>
+      </w:pPr>
+      <w:r>
+        <w:rPr>
+          <w:rFonts w:ascii="Times New Roman" w:hAnsi="Times New Roman" w:cs="Times New Roman"/>
+          <w:color w:val="000000"/>
+          <w:sz w:val="22"/>
+          <w:szCs w:val="22"/>
+        </w:rPr>
+        <w:t xml:space="preserve">Una empresa gestiona empleados de distintos tipos. Todos comparten datos y comportamiento comunes, pero cada tipo añade lo suyo. Es un caso natural de </w:t>
+      </w:r>
+      <w:r>
+        <w:rPr>
+          <w:rFonts w:ascii="Times New Roman" w:hAnsi="Times New Roman" w:cs="Times New Roman"/>
+          <w:b/>
+          <w:color w:val="000000"/>
+          <w:sz w:val="22"/>
+          <w:szCs w:val="22"/>
+        </w:rPr>
+        <w:t xml:space="preserve">generalización–especialización</w:t>
       </w:r>
       <w:r>
         <w:rPr>
@@ -594,204 +556,6 @@
           <w:szCs w:val="22"/>
         </w:rPr>
         <w:t xml:space="preserve">.</w:t>
-      </w:r>
-    </w:p>
-    <w:p>
-      <w:pPr>
-        <w:spacing w:after="120" w:line="276" w:lineRule="auto"/>
-        <w:ind w:left="454" w:hanging="284"/>
-      </w:pPr>
-      <w:r>
-        <w:rPr>
-          <w:rFonts w:ascii="Times New Roman" w:hAnsi="Times New Roman" w:cs="Times New Roman"/>
-          <w:color w:val="000000"/>
-          <w:sz w:val="22"/>
-          <w:szCs w:val="22"/>
-        </w:rPr>
-        <w:t xml:space="preserve">2.	</w:t>
-      </w:r>
-      <w:r>
-        <w:rPr>
-          <w:rFonts w:ascii="Times New Roman" w:hAnsi="Times New Roman" w:cs="Times New Roman"/>
-          <w:color w:val="000000"/>
-          <w:sz w:val="22"/>
-          <w:szCs w:val="22"/>
-        </w:rPr>
-        <w:t xml:space="preserve">Crea dos subclases: </w:t>
-      </w:r>
-      <w:r>
-        <w:rPr>
-          <w:rFonts w:ascii="Consolas" w:hAnsi="Consolas" w:cs="Consolas"/>
-          <w:color w:val="000000"/>
-          <w:sz w:val="22"/>
-          <w:szCs w:val="22"/>
-        </w:rPr>
-        <w:t xml:space="preserve">Gerente</w:t>
-      </w:r>
-      <w:r>
-        <w:rPr>
-          <w:rFonts w:ascii="Times New Roman" w:hAnsi="Times New Roman" w:cs="Times New Roman"/>
-          <w:color w:val="000000"/>
-          <w:sz w:val="22"/>
-          <w:szCs w:val="22"/>
-        </w:rPr>
-        <w:t xml:space="preserve"> (agrega </w:t>
-      </w:r>
-      <w:r>
-        <w:rPr>
-          <w:rFonts w:ascii="Consolas" w:hAnsi="Consolas" w:cs="Consolas"/>
-          <w:color w:val="000000"/>
-          <w:sz w:val="22"/>
-          <w:szCs w:val="22"/>
-        </w:rPr>
-        <w:t xml:space="preserve">bono</w:t>
-      </w:r>
-      <w:r>
-        <w:rPr>
-          <w:rFonts w:ascii="Times New Roman" w:hAnsi="Times New Roman" w:cs="Times New Roman"/>
-          <w:color w:val="000000"/>
-          <w:sz w:val="22"/>
-          <w:szCs w:val="22"/>
-        </w:rPr>
-        <w:t xml:space="preserve">) y </w:t>
-      </w:r>
-      <w:r>
-        <w:rPr>
-          <w:rFonts w:ascii="Consolas" w:hAnsi="Consolas" w:cs="Consolas"/>
-          <w:color w:val="000000"/>
-          <w:sz w:val="22"/>
-          <w:szCs w:val="22"/>
-        </w:rPr>
-        <w:t xml:space="preserve">Desarrollador</w:t>
-      </w:r>
-      <w:r>
-        <w:rPr>
-          <w:rFonts w:ascii="Times New Roman" w:hAnsi="Times New Roman" w:cs="Times New Roman"/>
-          <w:color w:val="000000"/>
-          <w:sz w:val="22"/>
-          <w:szCs w:val="22"/>
-        </w:rPr>
-        <w:t xml:space="preserve"> (agrega </w:t>
-      </w:r>
-      <w:r>
-        <w:rPr>
-          <w:rFonts w:ascii="Consolas" w:hAnsi="Consolas" w:cs="Consolas"/>
-          <w:color w:val="000000"/>
-          <w:sz w:val="22"/>
-          <w:szCs w:val="22"/>
-        </w:rPr>
-        <w:t xml:space="preserve">lenguaje</w:t>
-      </w:r>
-      <w:r>
-        <w:rPr>
-          <w:rFonts w:ascii="Times New Roman" w:hAnsi="Times New Roman" w:cs="Times New Roman"/>
-          <w:color w:val="000000"/>
-          <w:sz w:val="22"/>
-          <w:szCs w:val="22"/>
-        </w:rPr>
-        <w:t xml:space="preserve">).</w:t>
-      </w:r>
-    </w:p>
-    <w:p>
-      <w:pPr>
-        <w:spacing w:after="120" w:line="276" w:lineRule="auto"/>
-        <w:ind w:left="454" w:hanging="284"/>
-      </w:pPr>
-      <w:r>
-        <w:rPr>
-          <w:rFonts w:ascii="Times New Roman" w:hAnsi="Times New Roman" w:cs="Times New Roman"/>
-          <w:color w:val="000000"/>
-          <w:sz w:val="22"/>
-          <w:szCs w:val="22"/>
-        </w:rPr>
-        <w:t xml:space="preserve">3.	</w:t>
-      </w:r>
-      <w:r>
-        <w:rPr>
-          <w:rFonts w:ascii="Times New Roman" w:hAnsi="Times New Roman" w:cs="Times New Roman"/>
-          <w:color w:val="000000"/>
-          <w:sz w:val="22"/>
-          <w:szCs w:val="22"/>
-        </w:rPr>
-        <w:t xml:space="preserve">Usa </w:t>
-      </w:r>
-      <w:r>
-        <w:rPr>
-          <w:rFonts w:ascii="Consolas" w:hAnsi="Consolas" w:cs="Consolas"/>
-          <w:color w:val="000000"/>
-          <w:sz w:val="22"/>
-          <w:szCs w:val="22"/>
-        </w:rPr>
-        <w:t xml:space="preserve">super(...)</w:t>
-      </w:r>
-      <w:r>
-        <w:rPr>
-          <w:rFonts w:ascii="Times New Roman" w:hAnsi="Times New Roman" w:cs="Times New Roman"/>
-          <w:color w:val="000000"/>
-          <w:sz w:val="22"/>
-          <w:szCs w:val="22"/>
-        </w:rPr>
-        <w:t xml:space="preserve"> en los constructores y </w:t>
-      </w:r>
-      <w:r>
-        <w:rPr>
-          <w:rFonts w:ascii="Consolas" w:hAnsi="Consolas" w:cs="Consolas"/>
-          <w:color w:val="000000"/>
-          <w:sz w:val="22"/>
-          <w:szCs w:val="22"/>
-        </w:rPr>
-        <w:t xml:space="preserve">super.datos()</w:t>
-      </w:r>
-      <w:r>
-        <w:rPr>
-          <w:rFonts w:ascii="Times New Roman" w:hAnsi="Times New Roman" w:cs="Times New Roman"/>
-          <w:color w:val="000000"/>
-          <w:sz w:val="22"/>
-          <w:szCs w:val="22"/>
-        </w:rPr>
-        <w:t xml:space="preserve"> para ampliar la información.</w:t>
-      </w:r>
-    </w:p>
-    <w:p>
-      <w:pPr>
-        <w:spacing w:after="120" w:line="276" w:lineRule="auto"/>
-        <w:ind w:left="454" w:hanging="284"/>
-      </w:pPr>
-      <w:r>
-        <w:rPr>
-          <w:rFonts w:ascii="Times New Roman" w:hAnsi="Times New Roman" w:cs="Times New Roman"/>
-          <w:color w:val="000000"/>
-          <w:sz w:val="22"/>
-          <w:szCs w:val="22"/>
-        </w:rPr>
-        <w:t xml:space="preserve">4.	</w:t>
-      </w:r>
-      <w:r>
-        <w:rPr>
-          <w:rFonts w:ascii="Times New Roman" w:hAnsi="Times New Roman" w:cs="Times New Roman"/>
-          <w:color w:val="000000"/>
-          <w:sz w:val="22"/>
-          <w:szCs w:val="22"/>
-        </w:rPr>
-        <w:t xml:space="preserve">En </w:t>
-      </w:r>
-      <w:r>
-        <w:rPr>
-          <w:rFonts w:ascii="Consolas" w:hAnsi="Consolas" w:cs="Consolas"/>
-          <w:color w:val="000000"/>
-          <w:sz w:val="22"/>
-          <w:szCs w:val="22"/>
-        </w:rPr>
-        <w:t xml:space="preserve">main</w:t>
-      </w:r>
-      <w:r>
-        <w:rPr>
-          <w:rFonts w:ascii="Times New Roman" w:hAnsi="Times New Roman" w:cs="Times New Roman"/>
-          <w:color w:val="000000"/>
-          <w:sz w:val="22"/>
-          <w:szCs w:val="22"/>
-        </w:rPr>
-        <w:t xml:space="preserve">, crea un objeto de cada subclase e imprime sus datos.</w:t>
       </w:r>
     </w:p>
     <w:p>
@@ -810,7 +574,7 @@
           <w:sz w:val="26"/>
           <w:szCs w:val="26"/>
         </w:rPr>
-        <w:t xml:space="preserve">2. Requisitos</w:t>
+        <w:t xml:space="preserve">2. Enunciado</w:t>
       </w:r>
     </w:p>
     <w:p>
@@ -825,16 +589,26 @@
           <w:sz w:val="22"/>
           <w:szCs w:val="22"/>
         </w:rPr>
-        <w:t xml:space="preserve">•	</w:t>
-      </w:r>
-      <w:r>
-        <w:rPr>
-          <w:rFonts w:ascii="Times New Roman" w:hAnsi="Times New Roman" w:cs="Times New Roman"/>
-          <w:color w:val="000000"/>
-          <w:sz w:val="22"/>
-          <w:szCs w:val="22"/>
-        </w:rPr>
-        <w:t xml:space="preserve">Uso de </w:t>
+        <w:t xml:space="preserve">1.	</w:t>
+      </w:r>
+      <w:r>
+        <w:rPr>
+          <w:rFonts w:ascii="Times New Roman" w:hAnsi="Times New Roman" w:cs="Times New Roman"/>
+          <w:b/>
+          <w:color w:val="000000"/>
+          <w:sz w:val="22"/>
+          <w:szCs w:val="22"/>
+        </w:rPr>
+        <w:t xml:space="preserve">Diseño (antes de codificar).</w:t>
+      </w:r>
+      <w:r>
+        <w:rPr>
+          <w:rFonts w:ascii="Times New Roman" w:hAnsi="Times New Roman" w:cs="Times New Roman"/>
+          <w:color w:val="000000"/>
+          <w:sz w:val="22"/>
+          <w:szCs w:val="22"/>
+        </w:rPr>
+        <w:t xml:space="preserve"> Define la superclase </w:t>
       </w:r>
       <w:r>
         <w:rPr>
@@ -843,16 +617,16 @@
           <w:sz w:val="22"/>
           <w:szCs w:val="22"/>
         </w:rPr>
-        <w:t xml:space="preserve">extends</w:t>
-      </w:r>
-      <w:r>
-        <w:rPr>
-          <w:rFonts w:ascii="Times New Roman" w:hAnsi="Times New Roman" w:cs="Times New Roman"/>
-          <w:color w:val="000000"/>
-          <w:sz w:val="22"/>
-          <w:szCs w:val="22"/>
-        </w:rPr>
-        <w:t xml:space="preserve"> y </w:t>
+        <w:t xml:space="preserve">Empleado</w:t>
+      </w:r>
+      <w:r>
+        <w:rPr>
+          <w:rFonts w:ascii="Times New Roman" w:hAnsi="Times New Roman" w:cs="Times New Roman"/>
+          <w:color w:val="000000"/>
+          <w:sz w:val="22"/>
+          <w:szCs w:val="22"/>
+        </w:rPr>
+        <w:t xml:space="preserve"> (atributos comunes: </w:t>
       </w:r>
       <w:r>
         <w:rPr>
@@ -861,7 +635,171 @@
           <w:sz w:val="22"/>
           <w:szCs w:val="22"/>
         </w:rPr>
-        <w:t xml:space="preserve">super(...)</w:t>
+        <w:t xml:space="preserve">nombre</w:t>
+      </w:r>
+      <w:r>
+        <w:rPr>
+          <w:rFonts w:ascii="Times New Roman" w:hAnsi="Times New Roman" w:cs="Times New Roman"/>
+          <w:color w:val="000000"/>
+          <w:sz w:val="22"/>
+          <w:szCs w:val="22"/>
+        </w:rPr>
+        <w:t xml:space="preserve">, </w:t>
+      </w:r>
+      <w:r>
+        <w:rPr>
+          <w:rFonts w:ascii="Consolas" w:hAnsi="Consolas" w:cs="Consolas"/>
+          <w:color w:val="000000"/>
+          <w:sz w:val="22"/>
+          <w:szCs w:val="22"/>
+        </w:rPr>
+        <w:t xml:space="preserve">salarioBase</w:t>
+      </w:r>
+      <w:r>
+        <w:rPr>
+          <w:rFonts w:ascii="Times New Roman" w:hAnsi="Times New Roman" w:cs="Times New Roman"/>
+          <w:color w:val="000000"/>
+          <w:sz w:val="22"/>
+          <w:szCs w:val="22"/>
+        </w:rPr>
+        <w:t xml:space="preserve">; método </w:t>
+      </w:r>
+      <w:r>
+        <w:rPr>
+          <w:rFonts w:ascii="Consolas" w:hAnsi="Consolas" w:cs="Consolas"/>
+          <w:color w:val="000000"/>
+          <w:sz w:val="22"/>
+          <w:szCs w:val="22"/>
+        </w:rPr>
+        <w:t xml:space="preserve">ficha()</w:t>
+      </w:r>
+      <w:r>
+        <w:rPr>
+          <w:rFonts w:ascii="Times New Roman" w:hAnsi="Times New Roman" w:cs="Times New Roman"/>
+          <w:color w:val="000000"/>
+          <w:sz w:val="22"/>
+          <w:szCs w:val="22"/>
+        </w:rPr>
+        <w:t xml:space="preserve">) y </w:t>
+      </w:r>
+      <w:r>
+        <w:rPr>
+          <w:rFonts w:ascii="Times New Roman" w:hAnsi="Times New Roman" w:cs="Times New Roman"/>
+          <w:b/>
+          <w:color w:val="000000"/>
+          <w:sz w:val="22"/>
+          <w:szCs w:val="22"/>
+        </w:rPr>
+        <w:t xml:space="preserve">al menos dos</w:t>
+      </w:r>
+      <w:r>
+        <w:rPr>
+          <w:rFonts w:ascii="Times New Roman" w:hAnsi="Times New Roman" w:cs="Times New Roman"/>
+          <w:color w:val="000000"/>
+          <w:sz w:val="22"/>
+          <w:szCs w:val="22"/>
+        </w:rPr>
+        <w:t xml:space="preserve"> subclases: </w:t>
+      </w:r>
+      <w:r>
+        <w:rPr>
+          <w:rFonts w:ascii="Consolas" w:hAnsi="Consolas" w:cs="Consolas"/>
+          <w:color w:val="000000"/>
+          <w:sz w:val="22"/>
+          <w:szCs w:val="22"/>
+        </w:rPr>
+        <w:t xml:space="preserve">Gerente</w:t>
+      </w:r>
+      <w:r>
+        <w:rPr>
+          <w:rFonts w:ascii="Times New Roman" w:hAnsi="Times New Roman" w:cs="Times New Roman"/>
+          <w:color w:val="000000"/>
+          <w:sz w:val="22"/>
+          <w:szCs w:val="22"/>
+        </w:rPr>
+        <w:t xml:space="preserve"> (agrega </w:t>
+      </w:r>
+      <w:r>
+        <w:rPr>
+          <w:rFonts w:ascii="Consolas" w:hAnsi="Consolas" w:cs="Consolas"/>
+          <w:color w:val="000000"/>
+          <w:sz w:val="22"/>
+          <w:szCs w:val="22"/>
+        </w:rPr>
+        <w:t xml:space="preserve">bono</w:t>
+      </w:r>
+      <w:r>
+        <w:rPr>
+          <w:rFonts w:ascii="Times New Roman" w:hAnsi="Times New Roman" w:cs="Times New Roman"/>
+          <w:color w:val="000000"/>
+          <w:sz w:val="22"/>
+          <w:szCs w:val="22"/>
+        </w:rPr>
+        <w:t xml:space="preserve">) y </w:t>
+      </w:r>
+      <w:r>
+        <w:rPr>
+          <w:rFonts w:ascii="Consolas" w:hAnsi="Consolas" w:cs="Consolas"/>
+          <w:color w:val="000000"/>
+          <w:sz w:val="22"/>
+          <w:szCs w:val="22"/>
+        </w:rPr>
+        <w:t xml:space="preserve">Desarrollador</w:t>
+      </w:r>
+      <w:r>
+        <w:rPr>
+          <w:rFonts w:ascii="Times New Roman" w:hAnsi="Times New Roman" w:cs="Times New Roman"/>
+          <w:color w:val="000000"/>
+          <w:sz w:val="22"/>
+          <w:szCs w:val="22"/>
+        </w:rPr>
+        <w:t xml:space="preserve"> (agrega </w:t>
+      </w:r>
+      <w:r>
+        <w:rPr>
+          <w:rFonts w:ascii="Consolas" w:hAnsi="Consolas" w:cs="Consolas"/>
+          <w:color w:val="000000"/>
+          <w:sz w:val="22"/>
+          <w:szCs w:val="22"/>
+        </w:rPr>
+        <w:t xml:space="preserve">lenguaje</w:t>
+      </w:r>
+      <w:r>
+        <w:rPr>
+          <w:rFonts w:ascii="Times New Roman" w:hAnsi="Times New Roman" w:cs="Times New Roman"/>
+          <w:color w:val="000000"/>
+          <w:sz w:val="22"/>
+          <w:szCs w:val="22"/>
+        </w:rPr>
+        <w:t xml:space="preserve">). En el README, </w:t>
+      </w:r>
+      <w:r>
+        <w:rPr>
+          <w:rFonts w:ascii="Times New Roman" w:hAnsi="Times New Roman" w:cs="Times New Roman"/>
+          <w:b/>
+          <w:color w:val="000000"/>
+          <w:sz w:val="22"/>
+          <w:szCs w:val="22"/>
+        </w:rPr>
+        <w:t xml:space="preserve">justifica con el criterio es-un</w:t>
+      </w:r>
+      <w:r>
+        <w:rPr>
+          <w:rFonts w:ascii="Times New Roman" w:hAnsi="Times New Roman" w:cs="Times New Roman"/>
+          <w:color w:val="000000"/>
+          <w:sz w:val="22"/>
+          <w:szCs w:val="22"/>
+        </w:rPr>
+        <w:t xml:space="preserve"> por qué cada subclase hereda de </w:t>
+      </w:r>
+      <w:r>
+        <w:rPr>
+          <w:rFonts w:ascii="Consolas" w:hAnsi="Consolas" w:cs="Consolas"/>
+          <w:color w:val="000000"/>
+          <w:sz w:val="22"/>
+          <w:szCs w:val="22"/>
+        </w:rPr>
+        <w:t xml:space="preserve">Empleado</w:t>
       </w:r>
       <w:r>
         <w:rPr>
@@ -885,16 +823,26 @@
           <w:sz w:val="22"/>
           <w:szCs w:val="22"/>
         </w:rPr>
-        <w:t xml:space="preserve">•	</w:t>
-      </w:r>
-      <w:r>
-        <w:rPr>
-          <w:rFonts w:ascii="Times New Roman" w:hAnsi="Times New Roman" w:cs="Times New Roman"/>
-          <w:color w:val="000000"/>
-          <w:sz w:val="22"/>
-          <w:szCs w:val="22"/>
-        </w:rPr>
-        <w:t xml:space="preserve">Al menos un método que use </w:t>
+        <w:t xml:space="preserve">2.	</w:t>
+      </w:r>
+      <w:r>
+        <w:rPr>
+          <w:rFonts w:ascii="Times New Roman" w:hAnsi="Times New Roman" w:cs="Times New Roman"/>
+          <w:b/>
+          <w:color w:val="000000"/>
+          <w:sz w:val="22"/>
+          <w:szCs w:val="22"/>
+        </w:rPr>
+        <w:t xml:space="preserve">Constructores encadenados.</w:t>
+      </w:r>
+      <w:r>
+        <w:rPr>
+          <w:rFonts w:ascii="Times New Roman" w:hAnsi="Times New Roman" w:cs="Times New Roman"/>
+          <w:color w:val="000000"/>
+          <w:sz w:val="22"/>
+          <w:szCs w:val="22"/>
+        </w:rPr>
+        <w:t xml:space="preserve"> Cada subclase debe usar </w:t>
       </w:r>
       <w:r>
         <w:rPr>
@@ -903,16 +851,71 @@
           <w:sz w:val="22"/>
           <w:szCs w:val="22"/>
         </w:rPr>
-        <w:t xml:space="preserve">super.metodo()</w:t>
-      </w:r>
-      <w:r>
-        <w:rPr>
-          <w:rFonts w:ascii="Times New Roman" w:hAnsi="Times New Roman" w:cs="Times New Roman"/>
-          <w:color w:val="000000"/>
-          <w:sz w:val="22"/>
-          <w:szCs w:val="22"/>
-        </w:rPr>
-        <w:t xml:space="preserve">.</w:t>
+        <w:t xml:space="preserve">super(...)</w:t>
+      </w:r>
+      <w:r>
+        <w:rPr>
+          <w:rFonts w:ascii="Times New Roman" w:hAnsi="Times New Roman" w:cs="Times New Roman"/>
+          <w:color w:val="000000"/>
+          <w:sz w:val="22"/>
+          <w:szCs w:val="22"/>
+        </w:rPr>
+        <w:t xml:space="preserve"> para inicializar la parte </w:t>
+      </w:r>
+      <w:r>
+        <w:rPr>
+          <w:rFonts w:ascii="Consolas" w:hAnsi="Consolas" w:cs="Consolas"/>
+          <w:color w:val="000000"/>
+          <w:sz w:val="22"/>
+          <w:szCs w:val="22"/>
+        </w:rPr>
+        <w:t xml:space="preserve">Empleado</w:t>
+      </w:r>
+      <w:r>
+        <w:rPr>
+          <w:rFonts w:ascii="Times New Roman" w:hAnsi="Times New Roman" w:cs="Times New Roman"/>
+          <w:color w:val="000000"/>
+          <w:sz w:val="22"/>
+          <w:szCs w:val="22"/>
+        </w:rPr>
+        <w:t xml:space="preserve">. Agrega un </w:t>
+      </w:r>
+      <w:r>
+        <w:rPr>
+          <w:rFonts w:ascii="Consolas" w:hAnsi="Consolas" w:cs="Consolas"/>
+          <w:color w:val="000000"/>
+          <w:sz w:val="22"/>
+          <w:szCs w:val="22"/>
+        </w:rPr>
+        <w:t xml:space="preserve">System.out.println</w:t>
+      </w:r>
+      <w:r>
+        <w:rPr>
+          <w:rFonts w:ascii="Times New Roman" w:hAnsi="Times New Roman" w:cs="Times New Roman"/>
+          <w:color w:val="000000"/>
+          <w:sz w:val="22"/>
+          <w:szCs w:val="22"/>
+        </w:rPr>
+        <w:t xml:space="preserve"> en cada constructor para </w:t>
+      </w:r>
+      <w:r>
+        <w:rPr>
+          <w:rFonts w:ascii="Times New Roman" w:hAnsi="Times New Roman" w:cs="Times New Roman"/>
+          <w:b/>
+          <w:color w:val="000000"/>
+          <w:sz w:val="22"/>
+          <w:szCs w:val="22"/>
+        </w:rPr>
+        <w:t xml:space="preserve">trazar el orden</w:t>
+      </w:r>
+      <w:r>
+        <w:rPr>
+          <w:rFonts w:ascii="Times New Roman" w:hAnsi="Times New Roman" w:cs="Times New Roman"/>
+          <w:color w:val="000000"/>
+          <w:sz w:val="22"/>
+          <w:szCs w:val="22"/>
+        </w:rPr>
+        <w:t xml:space="preserve"> de construcción.</w:t>
       </w:r>
     </w:p>
     <w:p>
@@ -927,16 +930,238 @@
           <w:sz w:val="22"/>
           <w:szCs w:val="22"/>
         </w:rPr>
-        <w:t xml:space="preserve">•	</w:t>
-      </w:r>
-      <w:r>
-        <w:rPr>
-          <w:rFonts w:ascii="Times New Roman" w:hAnsi="Times New Roman" w:cs="Times New Roman"/>
-          <w:color w:val="000000"/>
-          <w:sz w:val="22"/>
-          <w:szCs w:val="22"/>
-        </w:rPr>
-        <w:t xml:space="preserve">Objetos de ambas subclases.</w:t>
+        <w:t xml:space="preserve">3.	</w:t>
+      </w:r>
+      <w:r>
+        <w:rPr>
+          <w:rFonts w:ascii="Times New Roman" w:hAnsi="Times New Roman" w:cs="Times New Roman"/>
+          <w:b/>
+          <w:color w:val="000000"/>
+          <w:sz w:val="22"/>
+          <w:szCs w:val="22"/>
+        </w:rPr>
+        <w:t xml:space="preserve">Ampliar comportamiento.</w:t>
+      </w:r>
+      <w:r>
+        <w:rPr>
+          <w:rFonts w:ascii="Times New Roman" w:hAnsi="Times New Roman" w:cs="Times New Roman"/>
+          <w:color w:val="000000"/>
+          <w:sz w:val="22"/>
+          <w:szCs w:val="22"/>
+        </w:rPr>
+        <w:t xml:space="preserve"> Sobrescribe </w:t>
+      </w:r>
+      <w:r>
+        <w:rPr>
+          <w:rFonts w:ascii="Consolas" w:hAnsi="Consolas" w:cs="Consolas"/>
+          <w:color w:val="000000"/>
+          <w:sz w:val="22"/>
+          <w:szCs w:val="22"/>
+        </w:rPr>
+        <w:t xml:space="preserve">ficha()</w:t>
+      </w:r>
+      <w:r>
+        <w:rPr>
+          <w:rFonts w:ascii="Times New Roman" w:hAnsi="Times New Roman" w:cs="Times New Roman"/>
+          <w:color w:val="000000"/>
+          <w:sz w:val="22"/>
+          <w:szCs w:val="22"/>
+        </w:rPr>
+        <w:t xml:space="preserve"> en cada subclase usando </w:t>
+      </w:r>
+      <w:r>
+        <w:rPr>
+          <w:rFonts w:ascii="Consolas" w:hAnsi="Consolas" w:cs="Consolas"/>
+          <w:color w:val="000000"/>
+          <w:sz w:val="22"/>
+          <w:szCs w:val="22"/>
+        </w:rPr>
+        <w:t xml:space="preserve">super.ficha()</w:t>
+      </w:r>
+      <w:r>
+        <w:rPr>
+          <w:rFonts w:ascii="Times New Roman" w:hAnsi="Times New Roman" w:cs="Times New Roman"/>
+          <w:color w:val="000000"/>
+          <w:sz w:val="22"/>
+          <w:szCs w:val="22"/>
+        </w:rPr>
+        <w:t xml:space="preserve"> para reutilizar la información base y añadir la específica.</w:t>
+      </w:r>
+    </w:p>
+    <w:p>
+      <w:pPr>
+        <w:spacing w:after="120" w:line="276" w:lineRule="auto"/>
+        <w:ind w:left="454" w:hanging="284"/>
+      </w:pPr>
+      <w:r>
+        <w:rPr>
+          <w:rFonts w:ascii="Times New Roman" w:hAnsi="Times New Roman" w:cs="Times New Roman"/>
+          <w:color w:val="000000"/>
+          <w:sz w:val="22"/>
+          <w:szCs w:val="22"/>
+        </w:rPr>
+        <w:t xml:space="preserve">4.	</w:t>
+      </w:r>
+      <w:r>
+        <w:rPr>
+          <w:rFonts w:ascii="Times New Roman" w:hAnsi="Times New Roman" w:cs="Times New Roman"/>
+          <w:b/>
+          <w:color w:val="000000"/>
+          <w:sz w:val="22"/>
+          <w:szCs w:val="22"/>
+        </w:rPr>
+        <w:t xml:space="preserve">Cálculo propio.</w:t>
+      </w:r>
+      <w:r>
+        <w:rPr>
+          <w:rFonts w:ascii="Times New Roman" w:hAnsi="Times New Roman" w:cs="Times New Roman"/>
+          <w:color w:val="000000"/>
+          <w:sz w:val="22"/>
+          <w:szCs w:val="22"/>
+        </w:rPr>
+        <w:t xml:space="preserve"> Agrega </w:t>
+      </w:r>
+      <w:r>
+        <w:rPr>
+          <w:rFonts w:ascii="Consolas" w:hAnsi="Consolas" w:cs="Consolas"/>
+          <w:color w:val="000000"/>
+          <w:sz w:val="22"/>
+          <w:szCs w:val="22"/>
+        </w:rPr>
+        <w:t xml:space="preserve">salarioTotal()</w:t>
+      </w:r>
+      <w:r>
+        <w:rPr>
+          <w:rFonts w:ascii="Times New Roman" w:hAnsi="Times New Roman" w:cs="Times New Roman"/>
+          <w:color w:val="000000"/>
+          <w:sz w:val="22"/>
+          <w:szCs w:val="22"/>
+        </w:rPr>
+        <w:t xml:space="preserve">: en </w:t>
+      </w:r>
+      <w:r>
+        <w:rPr>
+          <w:rFonts w:ascii="Consolas" w:hAnsi="Consolas" w:cs="Consolas"/>
+          <w:color w:val="000000"/>
+          <w:sz w:val="22"/>
+          <w:szCs w:val="22"/>
+        </w:rPr>
+        <w:t xml:space="preserve">Gerente</w:t>
+      </w:r>
+      <w:r>
+        <w:rPr>
+          <w:rFonts w:ascii="Times New Roman" w:hAnsi="Times New Roman" w:cs="Times New Roman"/>
+          <w:color w:val="000000"/>
+          <w:sz w:val="22"/>
+          <w:szCs w:val="22"/>
+        </w:rPr>
+        <w:t xml:space="preserve"> suma el bono; en </w:t>
+      </w:r>
+      <w:r>
+        <w:rPr>
+          <w:rFonts w:ascii="Consolas" w:hAnsi="Consolas" w:cs="Consolas"/>
+          <w:color w:val="000000"/>
+          <w:sz w:val="22"/>
+          <w:szCs w:val="22"/>
+        </w:rPr>
+        <w:t xml:space="preserve">Desarrollador</w:t>
+      </w:r>
+      <w:r>
+        <w:rPr>
+          <w:rFonts w:ascii="Times New Roman" w:hAnsi="Times New Roman" w:cs="Times New Roman"/>
+          <w:color w:val="000000"/>
+          <w:sz w:val="22"/>
+          <w:szCs w:val="22"/>
+        </w:rPr>
+        <w:t xml:space="preserve"> es el salario base.</w:t>
+      </w:r>
+    </w:p>
+    <w:p>
+      <w:pPr>
+        <w:spacing w:after="120" w:line="276" w:lineRule="auto"/>
+        <w:ind w:left="454" w:hanging="284"/>
+      </w:pPr>
+      <w:r>
+        <w:rPr>
+          <w:rFonts w:ascii="Times New Roman" w:hAnsi="Times New Roman" w:cs="Times New Roman"/>
+          <w:color w:val="000000"/>
+          <w:sz w:val="22"/>
+          <w:szCs w:val="22"/>
+        </w:rPr>
+        <w:t xml:space="preserve">5.	</w:t>
+      </w:r>
+      <w:r>
+        <w:rPr>
+          <w:rFonts w:ascii="Times New Roman" w:hAnsi="Times New Roman" w:cs="Times New Roman"/>
+          <w:b/>
+          <w:color w:val="000000"/>
+          <w:sz w:val="22"/>
+          <w:szCs w:val="22"/>
+        </w:rPr>
+        <w:t xml:space="preserve">Prueba.</w:t>
+      </w:r>
+      <w:r>
+        <w:rPr>
+          <w:rFonts w:ascii="Times New Roman" w:hAnsi="Times New Roman" w:cs="Times New Roman"/>
+          <w:color w:val="000000"/>
+          <w:sz w:val="22"/>
+          <w:szCs w:val="22"/>
+        </w:rPr>
+        <w:t xml:space="preserve"> En </w:t>
+      </w:r>
+      <w:r>
+        <w:rPr>
+          <w:rFonts w:ascii="Consolas" w:hAnsi="Consolas" w:cs="Consolas"/>
+          <w:color w:val="000000"/>
+          <w:sz w:val="22"/>
+          <w:szCs w:val="22"/>
+        </w:rPr>
+        <w:t xml:space="preserve">main</w:t>
+      </w:r>
+      <w:r>
+        <w:rPr>
+          <w:rFonts w:ascii="Times New Roman" w:hAnsi="Times New Roman" w:cs="Times New Roman"/>
+          <w:color w:val="000000"/>
+          <w:sz w:val="22"/>
+          <w:szCs w:val="22"/>
+        </w:rPr>
+        <w:t xml:space="preserve">, crea un objeto de cada subclase, imprime su </w:t>
+      </w:r>
+      <w:r>
+        <w:rPr>
+          <w:rFonts w:ascii="Consolas" w:hAnsi="Consolas" w:cs="Consolas"/>
+          <w:color w:val="000000"/>
+          <w:sz w:val="22"/>
+          <w:szCs w:val="22"/>
+        </w:rPr>
+        <w:t xml:space="preserve">ficha()</w:t>
+      </w:r>
+      <w:r>
+        <w:rPr>
+          <w:rFonts w:ascii="Times New Roman" w:hAnsi="Times New Roman" w:cs="Times New Roman"/>
+          <w:color w:val="000000"/>
+          <w:sz w:val="22"/>
+          <w:szCs w:val="22"/>
+        </w:rPr>
+        <w:t xml:space="preserve"> y su </w:t>
+      </w:r>
+      <w:r>
+        <w:rPr>
+          <w:rFonts w:ascii="Consolas" w:hAnsi="Consolas" w:cs="Consolas"/>
+          <w:color w:val="000000"/>
+          <w:sz w:val="22"/>
+          <w:szCs w:val="22"/>
+        </w:rPr>
+        <w:t xml:space="preserve">salarioTotal()</w:t>
+      </w:r>
+      <w:r>
+        <w:rPr>
+          <w:rFonts w:ascii="Times New Roman" w:hAnsi="Times New Roman" w:cs="Times New Roman"/>
+          <w:color w:val="000000"/>
+          <w:sz w:val="22"/>
+          <w:szCs w:val="22"/>
+        </w:rPr>
+        <w:t xml:space="preserve">, y muestra la traza del orden de construcción.</w:t>
       </w:r>
     </w:p>
     <w:p>
@@ -955,41 +1180,31 @@
           <w:sz w:val="26"/>
           <w:szCs w:val="26"/>
         </w:rPr>
-        <w:t xml:space="preserve">3. Cómo entregar</w:t>
+        <w:t xml:space="preserve">3. Requisitos técnicos</w:t>
       </w:r>
     </w:p>
     <w:p>
       <w:pPr>
         <w:spacing w:after="120" w:line="276" w:lineRule="auto"/>
-        <w:jc w:val="both"/>
-      </w:pPr>
-      <w:r>
-        <w:rPr>
-          <w:rFonts w:ascii="Times New Roman" w:hAnsi="Times New Roman" w:cs="Times New Roman"/>
-          <w:color w:val="000000"/>
-          <w:sz w:val="22"/>
-          <w:szCs w:val="22"/>
-        </w:rPr>
-        <w:t xml:space="preserve">Entrega </w:t>
-      </w:r>
-      <w:r>
-        <w:rPr>
-          <w:rFonts w:ascii="Times New Roman" w:hAnsi="Times New Roman" w:cs="Times New Roman"/>
-          <w:b/>
-          <w:color w:val="000000"/>
-          <w:sz w:val="22"/>
-          <w:szCs w:val="22"/>
-        </w:rPr>
-        <w:t xml:space="preserve">por GitHub</w:t>
-      </w:r>
-      <w:r>
-        <w:rPr>
-          <w:rFonts w:ascii="Times New Roman" w:hAnsi="Times New Roman" w:cs="Times New Roman"/>
-          <w:color w:val="000000"/>
-          <w:sz w:val="22"/>
-          <w:szCs w:val="22"/>
-        </w:rPr>
-        <w:t xml:space="preserve">. Repositorio: </w:t>
+        <w:ind w:left="454" w:hanging="284"/>
+      </w:pPr>
+      <w:r>
+        <w:rPr>
+          <w:rFonts w:ascii="Times New Roman" w:hAnsi="Times New Roman" w:cs="Times New Roman"/>
+          <w:color w:val="000000"/>
+          <w:sz w:val="22"/>
+          <w:szCs w:val="22"/>
+        </w:rPr>
+        <w:t xml:space="preserve">•	</w:t>
+      </w:r>
+      <w:r>
+        <w:rPr>
+          <w:rFonts w:ascii="Times New Roman" w:hAnsi="Times New Roman" w:cs="Times New Roman"/>
+          <w:color w:val="000000"/>
+          <w:sz w:val="22"/>
+          <w:szCs w:val="22"/>
+        </w:rPr>
+        <w:t xml:space="preserve">Uso correcto de </w:t>
       </w:r>
       <w:r>
         <w:rPr>
@@ -998,68 +1213,140 @@
           <w:sz w:val="22"/>
           <w:szCs w:val="22"/>
         </w:rPr>
-        <w:t xml:space="preserve">poo-s06-herencia</w:t>
-      </w:r>
-      <w:r>
-        <w:rPr>
-          <w:rFonts w:ascii="Times New Roman" w:hAnsi="Times New Roman" w:cs="Times New Roman"/>
-          <w:color w:val="000000"/>
-          <w:sz w:val="22"/>
-          <w:szCs w:val="22"/>
-        </w:rPr>
-        <w:t xml:space="preserve">.</w:t>
+        <w:t xml:space="preserve">extends</w:t>
+      </w:r>
+      <w:r>
+        <w:rPr>
+          <w:rFonts w:ascii="Times New Roman" w:hAnsi="Times New Roman" w:cs="Times New Roman"/>
+          <w:color w:val="000000"/>
+          <w:sz w:val="22"/>
+          <w:szCs w:val="22"/>
+        </w:rPr>
+        <w:t xml:space="preserve"> y </w:t>
+      </w:r>
+      <w:r>
+        <w:rPr>
+          <w:rFonts w:ascii="Consolas" w:hAnsi="Consolas" w:cs="Consolas"/>
+          <w:color w:val="000000"/>
+          <w:sz w:val="22"/>
+          <w:szCs w:val="22"/>
+        </w:rPr>
+        <w:t xml:space="preserve">super(...)</w:t>
+      </w:r>
+      <w:r>
+        <w:rPr>
+          <w:rFonts w:ascii="Times New Roman" w:hAnsi="Times New Roman" w:cs="Times New Roman"/>
+          <w:color w:val="000000"/>
+          <w:sz w:val="22"/>
+          <w:szCs w:val="22"/>
+        </w:rPr>
+        <w:t xml:space="preserve"> (primera instrucción).</w:t>
       </w:r>
     </w:p>
     <w:p>
       <w:pPr>
-        <w:spacing w:after="0" w:line="276" w:lineRule="auto"/>
-        <w:ind w:left="120"/>
-        <w:shd w:val="clear" w:color="auto" w:fill="F0F4F4"/>
-      </w:pPr>
+        <w:spacing w:after="120" w:line="276" w:lineRule="auto"/>
+        <w:ind w:left="454" w:hanging="284"/>
+      </w:pPr>
+      <w:r>
+        <w:rPr>
+          <w:rFonts w:ascii="Times New Roman" w:hAnsi="Times New Roman" w:cs="Times New Roman"/>
+          <w:color w:val="000000"/>
+          <w:sz w:val="22"/>
+          <w:szCs w:val="22"/>
+        </w:rPr>
+        <w:t xml:space="preserve">•	</w:t>
+      </w:r>
+      <w:r>
+        <w:rPr>
+          <w:rFonts w:ascii="Times New Roman" w:hAnsi="Times New Roman" w:cs="Times New Roman"/>
+          <w:color w:val="000000"/>
+          <w:sz w:val="22"/>
+          <w:szCs w:val="22"/>
+        </w:rPr>
+        <w:t xml:space="preserve">Al menos un método que use </w:t>
+      </w:r>
       <w:r>
         <w:rPr>
           <w:rFonts w:ascii="Consolas" w:hAnsi="Consolas" w:cs="Consolas"/>
-          <w:color w:val="2C3E50"/>
-          <w:sz w:val="18"/>
-          <w:szCs w:val="18"/>
-        </w:rPr>
-        <w:t xml:space="preserve">poo-s06-herencia/</w:t>
+          <w:color w:val="000000"/>
+          <w:sz w:val="22"/>
+          <w:szCs w:val="22"/>
+        </w:rPr>
+        <w:t xml:space="preserve">super.metodo()</w:t>
+      </w:r>
+      <w:r>
+        <w:rPr>
+          <w:rFonts w:ascii="Times New Roman" w:hAnsi="Times New Roman" w:cs="Times New Roman"/>
+          <w:color w:val="000000"/>
+          <w:sz w:val="22"/>
+          <w:szCs w:val="22"/>
+        </w:rPr>
+        <w:t xml:space="preserve">.</w:t>
       </w:r>
     </w:p>
     <w:p>
       <w:pPr>
-        <w:spacing w:after="0" w:line="276" w:lineRule="auto"/>
-        <w:ind w:left="120"/>
-        <w:shd w:val="clear" w:color="auto" w:fill="F0F4F4"/>
-      </w:pPr>
+        <w:spacing w:after="120" w:line="276" w:lineRule="auto"/>
+        <w:ind w:left="454" w:hanging="284"/>
+      </w:pPr>
+      <w:r>
+        <w:rPr>
+          <w:rFonts w:ascii="Times New Roman" w:hAnsi="Times New Roman" w:cs="Times New Roman"/>
+          <w:color w:val="000000"/>
+          <w:sz w:val="22"/>
+          <w:szCs w:val="22"/>
+        </w:rPr>
+        <w:t xml:space="preserve">•	</w:t>
+      </w:r>
+      <w:r>
+        <w:rPr>
+          <w:rFonts w:ascii="Times New Roman" w:hAnsi="Times New Roman" w:cs="Times New Roman"/>
+          <w:color w:val="000000"/>
+          <w:sz w:val="22"/>
+          <w:szCs w:val="22"/>
+        </w:rPr>
+        <w:t xml:space="preserve">Atributos con el acceso adecuado (</w:t>
+      </w:r>
       <w:r>
         <w:rPr>
           <w:rFonts w:ascii="Consolas" w:hAnsi="Consolas" w:cs="Consolas"/>
-          <w:color w:val="2C3E50"/>
-          <w:sz w:val="18"/>
-          <w:szCs w:val="18"/>
-        </w:rPr>
-        <w:t xml:space="preserve">  README.md   -&gt; jerarquia + salida de ejemplo</w:t>
+          <w:color w:val="000000"/>
+          <w:sz w:val="22"/>
+          <w:szCs w:val="22"/>
+        </w:rPr>
+        <w:t xml:space="preserve">protected</w:t>
+      </w:r>
+      <w:r>
+        <w:rPr>
+          <w:rFonts w:ascii="Times New Roman" w:hAnsi="Times New Roman" w:cs="Times New Roman"/>
+          <w:color w:val="000000"/>
+          <w:sz w:val="22"/>
+          <w:szCs w:val="22"/>
+        </w:rPr>
+        <w:t xml:space="preserve">/</w:t>
+      </w:r>
+      <w:r>
+        <w:rPr>
+          <w:rFonts w:ascii="Consolas" w:hAnsi="Consolas" w:cs="Consolas"/>
+          <w:color w:val="000000"/>
+          <w:sz w:val="22"/>
+          <w:szCs w:val="22"/>
+        </w:rPr>
+        <w:t xml:space="preserve">private</w:t>
+      </w:r>
+      <w:r>
+        <w:rPr>
+          <w:rFonts w:ascii="Times New Roman" w:hAnsi="Times New Roman" w:cs="Times New Roman"/>
+          <w:color w:val="000000"/>
+          <w:sz w:val="22"/>
+          <w:szCs w:val="22"/>
+        </w:rPr>
+        <w:t xml:space="preserve"> justificado).</w:t>
       </w:r>
     </w:p>
     <w:p>
       <w:pPr>
-        <w:spacing w:after="0" w:line="276" w:lineRule="auto"/>
-        <w:ind w:left="120"/>
-        <w:shd w:val="clear" w:color="auto" w:fill="F0F4F4"/>
-      </w:pPr>
-      <w:r>
-        <w:rPr>
-          <w:rFonts w:ascii="Consolas" w:hAnsi="Consolas" w:cs="Consolas"/>
-          <w:color w:val="2C3E50"/>
-          <w:sz w:val="18"/>
-          <w:szCs w:val="18"/>
-        </w:rPr>
-        <w:t xml:space="preserve">  src/         -&gt; Empleado.java, Gerente.java, Desarrollador.java, Main.java</w:t>
-      </w:r>
-    </w:p>
-    <w:p>
-      <w:pPr>
         <w:spacing w:after="120" w:line="276" w:lineRule="auto"/>
         <w:ind w:left="454" w:hanging="284"/>
       </w:pPr>
@@ -1070,64 +1357,16 @@
           <w:sz w:val="22"/>
           <w:szCs w:val="22"/>
         </w:rPr>
-        <w:t xml:space="preserve">1.	</w:t>
-      </w:r>
-      <w:r>
-        <w:rPr>
-          <w:rFonts w:ascii="Times New Roman" w:hAnsi="Times New Roman" w:cs="Times New Roman"/>
-          <w:color w:val="000000"/>
-          <w:sz w:val="22"/>
-          <w:szCs w:val="22"/>
-        </w:rPr>
-        <w:t xml:space="preserve">Crea el repo público con ese nombre.</w:t>
-      </w:r>
-    </w:p>
-    <w:p>
-      <w:pPr>
-        <w:spacing w:after="120" w:line="276" w:lineRule="auto"/>
-        <w:ind w:left="454" w:hanging="284"/>
-      </w:pPr>
-      <w:r>
-        <w:rPr>
-          <w:rFonts w:ascii="Times New Roman" w:hAnsi="Times New Roman" w:cs="Times New Roman"/>
-          <w:color w:val="000000"/>
-          <w:sz w:val="22"/>
-          <w:szCs w:val="22"/>
-        </w:rPr>
-        <w:t xml:space="preserve">2.	</w:t>
-      </w:r>
-      <w:r>
-        <w:rPr>
-          <w:rFonts w:ascii="Times New Roman" w:hAnsi="Times New Roman" w:cs="Times New Roman"/>
-          <w:color w:val="000000"/>
-          <w:sz w:val="22"/>
-          <w:szCs w:val="22"/>
-        </w:rPr>
-        <w:t xml:space="preserve">Sube el código y el README.</w:t>
-      </w:r>
-    </w:p>
-    <w:p>
-      <w:pPr>
-        <w:spacing w:after="120" w:line="276" w:lineRule="auto"/>
-        <w:ind w:left="454" w:hanging="284"/>
-      </w:pPr>
-      <w:r>
-        <w:rPr>
-          <w:rFonts w:ascii="Times New Roman" w:hAnsi="Times New Roman" w:cs="Times New Roman"/>
-          <w:color w:val="000000"/>
-          <w:sz w:val="22"/>
-          <w:szCs w:val="22"/>
-        </w:rPr>
-        <w:t xml:space="preserve">3.	</w:t>
-      </w:r>
-      <w:r>
-        <w:rPr>
-          <w:rFonts w:ascii="Times New Roman" w:hAnsi="Times New Roman" w:cs="Times New Roman"/>
-          <w:color w:val="000000"/>
-          <w:sz w:val="22"/>
-          <w:szCs w:val="22"/>
-        </w:rPr>
-        <w:t xml:space="preserve">Comparte el enlace por el canal indicado.</w:t>
+        <w:t xml:space="preserve">•	</w:t>
+      </w:r>
+      <w:r>
+        <w:rPr>
+          <w:rFonts w:ascii="Times New Roman" w:hAnsi="Times New Roman" w:cs="Times New Roman"/>
+          <w:color w:val="000000"/>
+          <w:sz w:val="22"/>
+          <w:szCs w:val="22"/>
+        </w:rPr>
+        <w:t xml:space="preserve">README con: diagrama de la jerarquía, justificación es-un y la traza de construcción obtenida.</w:t>
       </w:r>
     </w:p>
     <w:p>
@@ -1146,7 +1385,301 @@
           <w:sz w:val="26"/>
           <w:szCs w:val="26"/>
         </w:rPr>
-        <w:t xml:space="preserve">4. Rúbrica de evaluación</w:t>
+        <w:t xml:space="preserve">4. Reto opcional (+)</w:t>
+      </w:r>
+    </w:p>
+    <w:p>
+      <w:pPr>
+        <w:spacing w:after="120" w:line="276" w:lineRule="auto"/>
+        <w:ind w:left="454" w:hanging="284"/>
+      </w:pPr>
+      <w:r>
+        <w:rPr>
+          <w:rFonts w:ascii="Times New Roman" w:hAnsi="Times New Roman" w:cs="Times New Roman"/>
+          <w:color w:val="000000"/>
+          <w:sz w:val="22"/>
+          <w:szCs w:val="22"/>
+        </w:rPr>
+        <w:t xml:space="preserve">•	</w:t>
+      </w:r>
+      <w:r>
+        <w:rPr>
+          <w:rFonts w:ascii="Times New Roman" w:hAnsi="Times New Roman" w:cs="Times New Roman"/>
+          <w:color w:val="000000"/>
+          <w:sz w:val="22"/>
+          <w:szCs w:val="22"/>
+        </w:rPr>
+        <w:t xml:space="preserve">Agrega un tercer nivel (</w:t>
+      </w:r>
+      <w:r>
+        <w:rPr>
+          <w:rFonts w:ascii="Consolas" w:hAnsi="Consolas" w:cs="Consolas"/>
+          <w:color w:val="000000"/>
+          <w:sz w:val="22"/>
+          <w:szCs w:val="22"/>
+        </w:rPr>
+        <w:t xml:space="preserve">GerenteRegional extends Gerente</w:t>
+      </w:r>
+      <w:r>
+        <w:rPr>
+          <w:rFonts w:ascii="Times New Roman" w:hAnsi="Times New Roman" w:cs="Times New Roman"/>
+          <w:color w:val="000000"/>
+          <w:sz w:val="22"/>
+          <w:szCs w:val="22"/>
+        </w:rPr>
+        <w:t xml:space="preserve">) y observa/traza la cadena de tres constructores.</w:t>
+      </w:r>
+    </w:p>
+    <w:p>
+      <w:pPr>
+        <w:spacing w:after="120" w:line="276" w:lineRule="auto"/>
+        <w:ind w:left="454" w:hanging="284"/>
+      </w:pPr>
+      <w:r>
+        <w:rPr>
+          <w:rFonts w:ascii="Times New Roman" w:hAnsi="Times New Roman" w:cs="Times New Roman"/>
+          <w:color w:val="000000"/>
+          <w:sz w:val="22"/>
+          <w:szCs w:val="22"/>
+        </w:rPr>
+        <w:t xml:space="preserve">•	</w:t>
+      </w:r>
+      <w:r>
+        <w:rPr>
+          <w:rFonts w:ascii="Times New Roman" w:hAnsi="Times New Roman" w:cs="Times New Roman"/>
+          <w:color w:val="000000"/>
+          <w:sz w:val="22"/>
+          <w:szCs w:val="22"/>
+        </w:rPr>
+        <w:t xml:space="preserve">Marca algún método como </w:t>
+      </w:r>
+      <w:r>
+        <w:rPr>
+          <w:rFonts w:ascii="Consolas" w:hAnsi="Consolas" w:cs="Consolas"/>
+          <w:color w:val="000000"/>
+          <w:sz w:val="22"/>
+          <w:szCs w:val="22"/>
+        </w:rPr>
+        <w:t xml:space="preserve">final</w:t>
+      </w:r>
+      <w:r>
+        <w:rPr>
+          <w:rFonts w:ascii="Times New Roman" w:hAnsi="Times New Roman" w:cs="Times New Roman"/>
+          <w:color w:val="000000"/>
+          <w:sz w:val="22"/>
+          <w:szCs w:val="22"/>
+        </w:rPr>
+        <w:t xml:space="preserve"> y explica por qué no debería sobrescribirse.</w:t>
+      </w:r>
+    </w:p>
+    <w:p>
+      <w:pPr>
+        <w:spacing w:before="200" w:after="100" w:line="276" w:lineRule="auto"/>
+        <w:pBdr>
+          <w:bottom w:val="single" w:sz="6" w:space="2" w:color="C0E218"/>
+        </w:pBdr>
+        <w:keepNext/>
+      </w:pPr>
+      <w:r>
+        <w:rPr>
+          <w:rFonts w:ascii="Times New Roman" w:hAnsi="Times New Roman" w:cs="Times New Roman"/>
+          <w:b/>
+          <w:color w:val="008083"/>
+          <w:sz w:val="26"/>
+          <w:szCs w:val="26"/>
+        </w:rPr>
+        <w:t xml:space="preserve">5. Cómo entregar</w:t>
+      </w:r>
+    </w:p>
+    <w:p>
+      <w:pPr>
+        <w:spacing w:after="120" w:line="276" w:lineRule="auto"/>
+        <w:jc w:val="both"/>
+      </w:pPr>
+      <w:r>
+        <w:rPr>
+          <w:rFonts w:ascii="Times New Roman" w:hAnsi="Times New Roman" w:cs="Times New Roman"/>
+          <w:color w:val="000000"/>
+          <w:sz w:val="22"/>
+          <w:szCs w:val="22"/>
+        </w:rPr>
+        <w:t xml:space="preserve">Entrega </w:t>
+      </w:r>
+      <w:r>
+        <w:rPr>
+          <w:rFonts w:ascii="Times New Roman" w:hAnsi="Times New Roman" w:cs="Times New Roman"/>
+          <w:b/>
+          <w:color w:val="000000"/>
+          <w:sz w:val="22"/>
+          <w:szCs w:val="22"/>
+        </w:rPr>
+        <w:t xml:space="preserve">por GitHub</w:t>
+      </w:r>
+      <w:r>
+        <w:rPr>
+          <w:rFonts w:ascii="Times New Roman" w:hAnsi="Times New Roman" w:cs="Times New Roman"/>
+          <w:color w:val="000000"/>
+          <w:sz w:val="22"/>
+          <w:szCs w:val="22"/>
+        </w:rPr>
+        <w:t xml:space="preserve">. Repositorio: </w:t>
+      </w:r>
+      <w:r>
+        <w:rPr>
+          <w:rFonts w:ascii="Consolas" w:hAnsi="Consolas" w:cs="Consolas"/>
+          <w:color w:val="000000"/>
+          <w:sz w:val="22"/>
+          <w:szCs w:val="22"/>
+        </w:rPr>
+        <w:t xml:space="preserve">poo-s06-herencia</w:t>
+      </w:r>
+      <w:r>
+        <w:rPr>
+          <w:rFonts w:ascii="Times New Roman" w:hAnsi="Times New Roman" w:cs="Times New Roman"/>
+          <w:color w:val="000000"/>
+          <w:sz w:val="22"/>
+          <w:szCs w:val="22"/>
+        </w:rPr>
+        <w:t xml:space="preserve">.</w:t>
+      </w:r>
+    </w:p>
+    <w:p>
+      <w:pPr>
+        <w:spacing w:after="0" w:line="276" w:lineRule="auto"/>
+        <w:ind w:left="120"/>
+        <w:shd w:val="clear" w:color="auto" w:fill="F0F4F4"/>
+      </w:pPr>
+      <w:r>
+        <w:rPr>
+          <w:rFonts w:ascii="Consolas" w:hAnsi="Consolas" w:cs="Consolas"/>
+          <w:color w:val="2C3E50"/>
+          <w:sz w:val="18"/>
+          <w:szCs w:val="18"/>
+        </w:rPr>
+        <w:t xml:space="preserve">poo-s06-herencia/</w:t>
+      </w:r>
+    </w:p>
+    <w:p>
+      <w:pPr>
+        <w:spacing w:after="0" w:line="276" w:lineRule="auto"/>
+        <w:ind w:left="120"/>
+        <w:shd w:val="clear" w:color="auto" w:fill="F0F4F4"/>
+      </w:pPr>
+      <w:r>
+        <w:rPr>
+          <w:rFonts w:ascii="Consolas" w:hAnsi="Consolas" w:cs="Consolas"/>
+          <w:color w:val="2C3E50"/>
+          <w:sz w:val="18"/>
+          <w:szCs w:val="18"/>
+        </w:rPr>
+        <w:t xml:space="preserve">  README.md   -&gt; diagrama + justificacion es-un + traza de construccion</w:t>
+      </w:r>
+    </w:p>
+    <w:p>
+      <w:pPr>
+        <w:spacing w:after="0" w:line="276" w:lineRule="auto"/>
+        <w:ind w:left="120"/>
+        <w:shd w:val="clear" w:color="auto" w:fill="F0F4F4"/>
+      </w:pPr>
+      <w:r>
+        <w:rPr>
+          <w:rFonts w:ascii="Consolas" w:hAnsi="Consolas" w:cs="Consolas"/>
+          <w:color w:val="2C3E50"/>
+          <w:sz w:val="18"/>
+          <w:szCs w:val="18"/>
+        </w:rPr>
+        <w:t xml:space="preserve">  src/         -&gt; Empleado.java, Gerente.java, Desarrollador.java, Main.java</w:t>
+      </w:r>
+    </w:p>
+    <w:p>
+      <w:pPr>
+        <w:spacing w:after="120" w:line="276" w:lineRule="auto"/>
+        <w:ind w:left="454" w:hanging="284"/>
+      </w:pPr>
+      <w:r>
+        <w:rPr>
+          <w:rFonts w:ascii="Times New Roman" w:hAnsi="Times New Roman" w:cs="Times New Roman"/>
+          <w:color w:val="000000"/>
+          <w:sz w:val="22"/>
+          <w:szCs w:val="22"/>
+        </w:rPr>
+        <w:t xml:space="preserve">1.	</w:t>
+      </w:r>
+      <w:r>
+        <w:rPr>
+          <w:rFonts w:ascii="Times New Roman" w:hAnsi="Times New Roman" w:cs="Times New Roman"/>
+          <w:color w:val="000000"/>
+          <w:sz w:val="22"/>
+          <w:szCs w:val="22"/>
+        </w:rPr>
+        <w:t xml:space="preserve">Crea el repositorio público con ese nombre.</w:t>
+      </w:r>
+    </w:p>
+    <w:p>
+      <w:pPr>
+        <w:spacing w:after="120" w:line="276" w:lineRule="auto"/>
+        <w:ind w:left="454" w:hanging="284"/>
+      </w:pPr>
+      <w:r>
+        <w:rPr>
+          <w:rFonts w:ascii="Times New Roman" w:hAnsi="Times New Roman" w:cs="Times New Roman"/>
+          <w:color w:val="000000"/>
+          <w:sz w:val="22"/>
+          <w:szCs w:val="22"/>
+        </w:rPr>
+        <w:t xml:space="preserve">2.	</w:t>
+      </w:r>
+      <w:r>
+        <w:rPr>
+          <w:rFonts w:ascii="Times New Roman" w:hAnsi="Times New Roman" w:cs="Times New Roman"/>
+          <w:color w:val="000000"/>
+          <w:sz w:val="22"/>
+          <w:szCs w:val="22"/>
+        </w:rPr>
+        <w:t xml:space="preserve">Sube el código y el README con el diseño y la traza.</w:t>
+      </w:r>
+    </w:p>
+    <w:p>
+      <w:pPr>
+        <w:spacing w:after="120" w:line="276" w:lineRule="auto"/>
+        <w:ind w:left="454" w:hanging="284"/>
+      </w:pPr>
+      <w:r>
+        <w:rPr>
+          <w:rFonts w:ascii="Times New Roman" w:hAnsi="Times New Roman" w:cs="Times New Roman"/>
+          <w:color w:val="000000"/>
+          <w:sz w:val="22"/>
+          <w:szCs w:val="22"/>
+        </w:rPr>
+        <w:t xml:space="preserve">3.	</w:t>
+      </w:r>
+      <w:r>
+        <w:rPr>
+          <w:rFonts w:ascii="Times New Roman" w:hAnsi="Times New Roman" w:cs="Times New Roman"/>
+          <w:color w:val="000000"/>
+          <w:sz w:val="22"/>
+          <w:szCs w:val="22"/>
+        </w:rPr>
+        <w:t xml:space="preserve">Comparte el enlace por el canal indicado por el docente.</w:t>
+      </w:r>
+    </w:p>
+    <w:p>
+      <w:pPr>
+        <w:spacing w:before="200" w:after="100" w:line="276" w:lineRule="auto"/>
+        <w:pBdr>
+          <w:bottom w:val="single" w:sz="6" w:space="2" w:color="C0E218"/>
+        </w:pBdr>
+        <w:keepNext/>
+      </w:pPr>
+      <w:r>
+        <w:rPr>
+          <w:rFonts w:ascii="Times New Roman" w:hAnsi="Times New Roman" w:cs="Times New Roman"/>
+          <w:b/>
+          <w:color w:val="008083"/>
+          <w:sz w:val="26"/>
+          <w:szCs w:val="26"/>
+        </w:rPr>
+        <w:t xml:space="preserve">6. Rúbrica de evaluación</w:t>
       </w:r>
     </w:p>
     <w:tbl>
@@ -1210,7 +1743,7 @@
                 <w:sz w:val="20"/>
                 <w:szCs w:val="20"/>
               </w:rPr>
-              <w:t xml:space="preserve">Excelente</w:t>
+              <w:t xml:space="preserve">Excelente (100%)</w:t>
             </w:r>
           </w:p>
         </w:tc>
@@ -1232,7 +1765,7 @@
                 <w:sz w:val="20"/>
                 <w:szCs w:val="20"/>
               </w:rPr>
-              <w:t xml:space="preserve">Aceptable</w:t>
+              <w:t xml:space="preserve">Aceptable (60%)</w:t>
             </w:r>
           </w:p>
         </w:tc>
@@ -1254,7 +1787,7 @@
                 <w:sz w:val="20"/>
                 <w:szCs w:val="20"/>
               </w:rPr>
-              <w:t xml:space="preserve">Por mejorar</w:t>
+              <w:t xml:space="preserve">Por mejorar (0%)</w:t>
             </w:r>
           </w:p>
         </w:tc>
@@ -1298,7 +1831,7 @@
                 <w:sz w:val="20"/>
                 <w:szCs w:val="20"/>
               </w:rPr>
-              <w:t xml:space="preserve">Herencia con extends</w:t>
+              <w:t xml:space="preserve">Diseño y justificación es-un</w:t>
             </w:r>
           </w:p>
         </w:tc>
@@ -1318,7 +1851,7 @@
                 <w:sz w:val="20"/>
                 <w:szCs w:val="20"/>
               </w:rPr>
-              <w:t xml:space="preserve">Correcta</w:t>
+              <w:t xml:space="preserve">Jerarquía correcta y bien justificada por sustitución</w:t>
             </w:r>
           </w:p>
         </w:tc>
@@ -1338,7 +1871,7 @@
                 <w:sz w:val="20"/>
                 <w:szCs w:val="20"/>
               </w:rPr>
-              <w:t xml:space="preserve">Con detalles</w:t>
+              <w:t xml:space="preserve">Justificación básica</w:t>
             </w:r>
           </w:p>
         </w:tc>
@@ -1358,7 +1891,7 @@
                 <w:sz w:val="20"/>
                 <w:szCs w:val="20"/>
               </w:rPr>
-              <w:t xml:space="preserve">Falla</w:t>
+              <w:t xml:space="preserve">Sin justificar o relación incorrecta</w:t>
             </w:r>
           </w:p>
         </w:tc>
@@ -1378,7 +1911,7 @@
                 <w:sz w:val="20"/>
                 <w:szCs w:val="20"/>
               </w:rPr>
-              <w:t xml:space="preserve">30</w:t>
+              <w:t xml:space="preserve">25</w:t>
             </w:r>
           </w:p>
         </w:tc>
@@ -1400,7 +1933,7 @@
                 <w:sz w:val="20"/>
                 <w:szCs w:val="20"/>
               </w:rPr>
-              <w:t xml:space="preserve">Uso de super(...)</w:t>
+              <w:t xml:space="preserve">Cadena de constructores (super)</w:t>
             </w:r>
           </w:p>
         </w:tc>
@@ -1420,7 +1953,7 @@
                 <w:sz w:val="20"/>
                 <w:szCs w:val="20"/>
               </w:rPr>
-              <w:t xml:space="preserve">Correcto</w:t>
+              <w:t xml:space="preserve">Correcta en todas las subclases + traza</w:t>
             </w:r>
           </w:p>
         </w:tc>
@@ -1440,7 +1973,7 @@
                 <w:sz w:val="20"/>
                 <w:szCs w:val="20"/>
               </w:rPr>
-              <w:t xml:space="preserve">Parcial</w:t>
+              <w:t xml:space="preserve">Con detalles</w:t>
             </w:r>
           </w:p>
         </w:tc>
@@ -1460,7 +1993,7 @@
                 <w:sz w:val="20"/>
                 <w:szCs w:val="20"/>
               </w:rPr>
-              <w:t xml:space="preserve">Ausente</w:t>
+              <w:t xml:space="preserve">Falla o ausente</w:t>
             </w:r>
           </w:p>
         </w:tc>
@@ -1480,7 +2013,7 @@
                 <w:sz w:val="20"/>
                 <w:szCs w:val="20"/>
               </w:rPr>
-              <w:t xml:space="preserve">30</w:t>
+              <w:t xml:space="preserve">25</w:t>
             </w:r>
           </w:p>
         </w:tc>
@@ -1502,7 +2035,7 @@
                 <w:sz w:val="20"/>
                 <w:szCs w:val="20"/>
               </w:rPr>
-              <w:t xml:space="preserve">super.metodo() (ampliar)</w:t>
+              <w:t xml:space="preserve">Ampliar con super.metodo()</w:t>
             </w:r>
           </w:p>
         </w:tc>
@@ -1522,7 +2055,7 @@
                 <w:sz w:val="20"/>
                 <w:szCs w:val="20"/>
               </w:rPr>
-              <w:t xml:space="preserve">Correcto</w:t>
+              <w:t xml:space="preserve">ficha() reutiliza y amplía correctamente</w:t>
             </w:r>
           </w:p>
         </w:tc>
@@ -1582,7 +2115,7 @@
                 <w:sz w:val="20"/>
                 <w:szCs w:val="20"/>
               </w:rPr>
-              <w:t xml:space="preserve">25</w:t>
+              <w:t xml:space="preserve">20</w:t>
             </w:r>
           </w:p>
         </w:tc>
@@ -1604,7 +2137,7 @@
                 <w:sz w:val="20"/>
                 <w:szCs w:val="20"/>
               </w:rPr>
-              <w:t xml:space="preserve">README y repositorio</w:t>
+              <w:t xml:space="preserve">salarioTotal() y pruebas</w:t>
             </w:r>
           </w:p>
         </w:tc>
@@ -1624,7 +2157,109 @@
                 <w:sz w:val="20"/>
                 <w:szCs w:val="20"/>
               </w:rPr>
-              <w:t xml:space="preserve">Ordenado</w:t>
+              <w:t xml:space="preserve">Correctos y probados</w:t>
+            </w:r>
+          </w:p>
+        </w:tc>
+        <w:tc>
+          <w:tcPr>
+            <w:tcW w:w="0" w:type="auto"/>
+            <w:vAlign w:val="center"/>
+          </w:tcPr>
+          <w:p>
+            <w:pPr>
+              <w:spacing w:after="20" w:before="20"/>
+            </w:pPr>
+            <w:r>
+              <w:rPr>
+                <w:rFonts w:ascii="Times New Roman" w:hAnsi="Times New Roman" w:cs="Times New Roman"/>
+                <w:color w:val="000000"/>
+                <w:sz w:val="20"/>
+                <w:szCs w:val="20"/>
+              </w:rPr>
+              <w:t xml:space="preserve">Parciales</w:t>
+            </w:r>
+          </w:p>
+        </w:tc>
+        <w:tc>
+          <w:tcPr>
+            <w:tcW w:w="0" w:type="auto"/>
+            <w:vAlign w:val="center"/>
+          </w:tcPr>
+          <w:p>
+            <w:pPr>
+              <w:spacing w:after="20" w:before="20"/>
+            </w:pPr>
+            <w:r>
+              <w:rPr>
+                <w:rFonts w:ascii="Times New Roman" w:hAnsi="Times New Roman" w:cs="Times New Roman"/>
+                <w:color w:val="000000"/>
+                <w:sz w:val="20"/>
+                <w:szCs w:val="20"/>
+              </w:rPr>
+              <w:t xml:space="preserve">Fallan</w:t>
+            </w:r>
+          </w:p>
+        </w:tc>
+        <w:tc>
+          <w:tcPr>
+            <w:tcW w:w="0" w:type="auto"/>
+            <w:vAlign w:val="center"/>
+          </w:tcPr>
+          <w:p>
+            <w:pPr>
+              <w:spacing w:after="20" w:before="20"/>
+            </w:pPr>
+            <w:r>
+              <w:rPr>
+                <w:rFonts w:ascii="Times New Roman" w:hAnsi="Times New Roman" w:cs="Times New Roman"/>
+                <w:color w:val="000000"/>
+                <w:sz w:val="20"/>
+                <w:szCs w:val="20"/>
+              </w:rPr>
+              <w:t xml:space="preserve">15</w:t>
+            </w:r>
+          </w:p>
+        </w:tc>
+      </w:tr>
+      <w:tr>
+        <w:tc>
+          <w:tcPr>
+            <w:tcW w:w="0" w:type="auto"/>
+            <w:vAlign w:val="center"/>
+          </w:tcPr>
+          <w:p>
+            <w:pPr>
+              <w:spacing w:after="20" w:before="20"/>
+            </w:pPr>
+            <w:r>
+              <w:rPr>
+                <w:rFonts w:ascii="Times New Roman" w:hAnsi="Times New Roman" w:cs="Times New Roman"/>
+                <w:color w:val="000000"/>
+                <w:sz w:val="20"/>
+                <w:szCs w:val="20"/>
+              </w:rPr>
+              <w:t xml:space="preserve">Calidad de código y README</w:t>
+            </w:r>
+          </w:p>
+        </w:tc>
+        <w:tc>
+          <w:tcPr>
+            <w:tcW w:w="0" w:type="auto"/>
+            <w:vAlign w:val="center"/>
+          </w:tcPr>
+          <w:p>
+            <w:pPr>
+              <w:spacing w:after="20" w:before="20"/>
+            </w:pPr>
+            <w:r>
+              <w:rPr>
+                <w:rFonts w:ascii="Times New Roman" w:hAnsi="Times New Roman" w:cs="Times New Roman"/>
+                <w:color w:val="000000"/>
+                <w:sz w:val="20"/>
+                <w:szCs w:val="20"/>
+              </w:rPr>
+              <w:t xml:space="preserve">Ordenado, diagrama y traza claros</w:t>
             </w:r>
           </w:p>
         </w:tc>
@@ -1703,7 +2338,7 @@
           <w:sz w:val="21"/>
           <w:szCs w:val="21"/>
         </w:rPr>
-        <w:t xml:space="preserve">Nota: actividad formativa y opcional (sin nota en Moodle). La guía unificada de entrega estará en el Manual de Entrega de Actividades Opcionales (próximamente).</w:t>
+        <w:t xml:space="preserve">Nota: actividad formativa y opcional (sin nota en Moodle). La guía unificada para entregar todas las actividades opcionales, válida para todas las materias, estará en el Manual de Entrega de Actividades Opcionales (próximamente).</w:t>
       </w:r>
     </w:p>
     <w:sectPr>

</xml_diff>